<commit_message>
docs: regenerate all Word documents with dedicated mathematical typography, Cambria Math styling, and equation cards
</commit_message>
<xml_diff>
--- a/MedLink_Backend_InDepth_Report.docx
+++ b/MedLink_Backend_InDepth_Report.docx
@@ -89,7 +89,6 @@
         <w:pStyle w:val="ListNumber"/>
         <w:spacing w:before="20" w:after="40"/>
       </w:pPr>
-      <w:r/>
       <w:r>
         <w:rPr>
           <w:b/>
@@ -105,7 +104,6 @@
         <w:pStyle w:val="ListNumber"/>
         <w:spacing w:before="20" w:after="40"/>
       </w:pPr>
-      <w:r/>
       <w:r>
         <w:rPr>
           <w:b/>
@@ -113,7 +111,19 @@
         <w:t>Mathematical Privacy Enforcement</w:t>
       </w:r>
       <w:r>
-        <w:t>: Implements Rényi Differential Privacy (RDP) moments accounting to provide mathematically provable $(\epsilon, \delta)$-DP bounds.</w:t>
+        <w:t xml:space="preserve">: Implements Rényi Differential Privacy (RDP) moments accounting to provide mathematically provable </w:t>
+      </w:r>
+      <w:r>
+        <w:rPr>
+          <w:rFonts w:ascii="Cambria Math" w:hAnsi="Cambria Math"/>
+          <w:i/>
+          <w:color w:val="1A365D"/>
+          <w:sz w:val="21"/>
+        </w:rPr>
+        <w:t>‖(‖ε‖,‖ ‖δ‖)‖</w:t>
+      </w:r>
+      <w:r>
+        <w:t>-DP bounds.</w:t>
       </w:r>
     </w:p>
     <w:p>
@@ -121,7 +131,6 @@
         <w:pStyle w:val="ListNumber"/>
         <w:spacing w:before="20" w:after="40"/>
       </w:pPr>
-      <w:r/>
       <w:r>
         <w:rPr>
           <w:b/>
@@ -137,7 +146,6 @@
         <w:pStyle w:val="ListNumber"/>
         <w:spacing w:before="20" w:after="40"/>
       </w:pPr>
-      <w:r/>
       <w:r>
         <w:rPr>
           <w:b/>
@@ -153,7 +161,6 @@
         <w:pStyle w:val="ListNumber"/>
         <w:spacing w:before="20" w:after="40"/>
       </w:pPr>
-      <w:r/>
       <w:r>
         <w:rPr>
           <w:b/>
@@ -161,7 +168,31 @@
         <w:t>Zero-Exposure Discovery</w:t>
       </w:r>
       <w:r>
-        <w:t>: Executes privacy-preserving cohort feasibility queries with $k$-anonymity ($\ge 5$) suppression.</w:t>
+        <w:t xml:space="preserve">: Executes privacy-preserving cohort feasibility queries with </w:t>
+      </w:r>
+      <w:r>
+        <w:rPr>
+          <w:rFonts w:ascii="Cambria Math" w:hAnsi="Cambria Math"/>
+          <w:i/>
+          <w:color w:val="1A365D"/>
+          <w:sz w:val="21"/>
+        </w:rPr>
+        <w:t>‖k‖</w:t>
+      </w:r>
+      <w:r>
+        <w:t>-anonymity (</w:t>
+      </w:r>
+      <w:r>
+        <w:rPr>
+          <w:rFonts w:ascii="Cambria Math" w:hAnsi="Cambria Math"/>
+          <w:i/>
+          <w:color w:val="1A365D"/>
+          <w:sz w:val="21"/>
+        </w:rPr>
+        <w:t>‖ ‖≥‖ ‖ ‖5‖</w:t>
+      </w:r>
+      <w:r>
+        <w:t>) suppression.</w:t>
       </w:r>
     </w:p>
     <w:p>
@@ -169,7 +200,6 @@
         <w:pStyle w:val="ListNumber"/>
         <w:spacing w:before="20" w:after="40"/>
       </w:pPr>
-      <w:r/>
       <w:r>
         <w:rPr>
           <w:b/>
@@ -315,7 +345,6 @@
       <w:pPr>
         <w:spacing w:before="40" w:after="80" w:line="276" w:lineRule="auto"/>
       </w:pPr>
-      <w:r/>
       <w:r>
         <w:rPr>
           <w:rFonts w:ascii="Consolas" w:hAnsi="Consolas"/>
@@ -348,7 +377,6 @@
         <w:pStyle w:val="ListBullet"/>
         <w:spacing w:before="20" w:after="40"/>
       </w:pPr>
-      <w:r/>
       <w:r>
         <w:rPr>
           <w:rFonts w:ascii="Consolas" w:hAnsi="Consolas"/>
@@ -366,7 +394,6 @@
         <w:pStyle w:val="ListBullet"/>
         <w:spacing w:before="20" w:after="40"/>
       </w:pPr>
-      <w:r/>
       <w:r>
         <w:rPr>
           <w:rFonts w:ascii="Consolas" w:hAnsi="Consolas"/>
@@ -384,7 +411,6 @@
         <w:pStyle w:val="ListBullet"/>
         <w:spacing w:before="20" w:after="40"/>
       </w:pPr>
-      <w:r/>
       <w:r>
         <w:rPr>
           <w:rFonts w:ascii="Consolas" w:hAnsi="Consolas"/>
@@ -438,7 +464,6 @@
       <w:pPr>
         <w:spacing w:before="40" w:after="80" w:line="276" w:lineRule="auto"/>
       </w:pPr>
-      <w:r/>
       <w:r>
         <w:rPr>
           <w:rFonts w:ascii="Consolas" w:hAnsi="Consolas"/>
@@ -471,7 +496,6 @@
         <w:pStyle w:val="ListBullet"/>
         <w:spacing w:before="20" w:after="40"/>
       </w:pPr>
-      <w:r/>
       <w:r>
         <w:rPr>
           <w:rFonts w:ascii="Consolas" w:hAnsi="Consolas"/>
@@ -500,7 +524,6 @@
         <w:pStyle w:val="ListBullet"/>
         <w:spacing w:before="20" w:after="40"/>
       </w:pPr>
-      <w:r/>
       <w:r>
         <w:rPr>
           <w:rFonts w:ascii="Consolas" w:hAnsi="Consolas"/>
@@ -529,7 +552,6 @@
         <w:pStyle w:val="ListBullet"/>
         <w:spacing w:before="20" w:after="40"/>
       </w:pPr>
-      <w:r/>
       <w:r>
         <w:rPr>
           <w:rFonts w:ascii="Consolas" w:hAnsi="Consolas"/>
@@ -547,7 +569,6 @@
         <w:pStyle w:val="ListBullet"/>
         <w:spacing w:before="20" w:after="40"/>
       </w:pPr>
-      <w:r/>
       <w:r>
         <w:rPr>
           <w:rFonts w:ascii="Consolas" w:hAnsi="Consolas"/>
@@ -679,7 +700,13 @@
               <w:rPr>
                 <w:sz w:val="19"/>
               </w:rPr>
-              <w:t>**Researcher**</w:t>
+            </w:r>
+            <w:r>
+              <w:rPr>
+                <w:b/>
+                <w:sz w:val="19"/>
+              </w:rPr>
+              <w:t>Researcher</w:t>
             </w:r>
           </w:p>
         </w:tc>
@@ -696,7 +723,14 @@
               <w:rPr>
                 <w:sz w:val="19"/>
               </w:rPr>
-              <w:t>`dr.smith@genome.edu`</w:t>
+            </w:r>
+            <w:r>
+              <w:rPr>
+                <w:rFonts w:ascii="Consolas" w:hAnsi="Consolas"/>
+                <w:color w:val="805AD5"/>
+                <w:sz w:val="19"/>
+              </w:rPr>
+              <w:t>dr.smith@genome.edu</w:t>
             </w:r>
           </w:p>
         </w:tc>
@@ -713,7 +747,14 @@
               <w:rPr>
                 <w:sz w:val="19"/>
               </w:rPr>
-              <w:t>`secure123`</w:t>
+            </w:r>
+            <w:r>
+              <w:rPr>
+                <w:rFonts w:ascii="Consolas" w:hAnsi="Consolas"/>
+                <w:color w:val="805AD5"/>
+                <w:sz w:val="19"/>
+              </w:rPr>
+              <w:t>secure123</w:t>
             </w:r>
           </w:p>
         </w:tc>
@@ -730,7 +771,40 @@
               <w:rPr>
                 <w:sz w:val="19"/>
               </w:rPr>
-              <w:t>Full access to `/api/fl/*`, `/api/discovery/*`, model inspection, and prediction</w:t>
+            </w:r>
+            <w:r>
+              <w:rPr>
+                <w:sz w:val="19"/>
+              </w:rPr>
+              <w:t xml:space="preserve">Full access to </w:t>
+            </w:r>
+            <w:r>
+              <w:rPr>
+                <w:rFonts w:ascii="Consolas" w:hAnsi="Consolas"/>
+                <w:color w:val="805AD5"/>
+                <w:sz w:val="19"/>
+              </w:rPr>
+              <w:t>/api/fl/*</w:t>
+            </w:r>
+            <w:r>
+              <w:rPr>
+                <w:sz w:val="19"/>
+              </w:rPr>
+              <w:t xml:space="preserve">, </w:t>
+            </w:r>
+            <w:r>
+              <w:rPr>
+                <w:rFonts w:ascii="Consolas" w:hAnsi="Consolas"/>
+                <w:color w:val="805AD5"/>
+                <w:sz w:val="19"/>
+              </w:rPr>
+              <w:t>/api/discovery/*</w:t>
+            </w:r>
+            <w:r>
+              <w:rPr>
+                <w:sz w:val="19"/>
+              </w:rPr>
+              <w:t>, model inspection, and prediction</w:t>
             </w:r>
           </w:p>
         </w:tc>
@@ -749,7 +823,13 @@
               <w:rPr>
                 <w:sz w:val="19"/>
               </w:rPr>
-              <w:t>**Patient**</w:t>
+            </w:r>
+            <w:r>
+              <w:rPr>
+                <w:b/>
+                <w:sz w:val="19"/>
+              </w:rPr>
+              <w:t>Patient</w:t>
             </w:r>
           </w:p>
         </w:tc>
@@ -766,7 +846,14 @@
               <w:rPr>
                 <w:sz w:val="19"/>
               </w:rPr>
-              <w:t>`alice.w@email.com`</w:t>
+            </w:r>
+            <w:r>
+              <w:rPr>
+                <w:rFonts w:ascii="Consolas" w:hAnsi="Consolas"/>
+                <w:color w:val="805AD5"/>
+                <w:sz w:val="19"/>
+              </w:rPr>
+              <w:t>alice.w@email.com</w:t>
             </w:r>
           </w:p>
         </w:tc>
@@ -783,7 +870,14 @@
               <w:rPr>
                 <w:sz w:val="19"/>
               </w:rPr>
-              <w:t>`health123`</w:t>
+            </w:r>
+            <w:r>
+              <w:rPr>
+                <w:rFonts w:ascii="Consolas" w:hAnsi="Consolas"/>
+                <w:color w:val="805AD5"/>
+                <w:sz w:val="19"/>
+              </w:rPr>
+              <w:t>health123</w:t>
             </w:r>
           </w:p>
         </w:tc>
@@ -796,6 +890,11 @@
             <w:pPr>
               <w:spacing w:before="60" w:after="60"/>
             </w:pPr>
+            <w:r>
+              <w:rPr>
+                <w:sz w:val="19"/>
+              </w:rPr>
+            </w:r>
             <w:r>
               <w:rPr>
                 <w:sz w:val="19"/>
@@ -819,7 +918,13 @@
               <w:rPr>
                 <w:sz w:val="19"/>
               </w:rPr>
-              <w:t>**Institution**</w:t>
+            </w:r>
+            <w:r>
+              <w:rPr>
+                <w:b/>
+                <w:sz w:val="19"/>
+              </w:rPr>
+              <w:t>Institution</w:t>
             </w:r>
           </w:p>
         </w:tc>
@@ -836,7 +941,14 @@
               <w:rPr>
                 <w:sz w:val="19"/>
               </w:rPr>
-              <w:t>`admin@mayoclinic.org`</w:t>
+            </w:r>
+            <w:r>
+              <w:rPr>
+                <w:rFonts w:ascii="Consolas" w:hAnsi="Consolas"/>
+                <w:color w:val="805AD5"/>
+                <w:sz w:val="19"/>
+              </w:rPr>
+              <w:t>admin@mayoclinic.org</w:t>
             </w:r>
           </w:p>
         </w:tc>
@@ -853,7 +965,14 @@
               <w:rPr>
                 <w:sz w:val="19"/>
               </w:rPr>
-              <w:t>`admin123`</w:t>
+            </w:r>
+            <w:r>
+              <w:rPr>
+                <w:rFonts w:ascii="Consolas" w:hAnsi="Consolas"/>
+                <w:color w:val="805AD5"/>
+                <w:sz w:val="19"/>
+              </w:rPr>
+              <w:t>admin123</w:t>
             </w:r>
           </w:p>
         </w:tc>
@@ -870,6 +989,11 @@
               <w:rPr>
                 <w:sz w:val="19"/>
               </w:rPr>
+            </w:r>
+            <w:r>
+              <w:rPr>
+                <w:sz w:val="19"/>
+              </w:rPr>
               <w:t>Node metrics, privacy budget audit, compliance status</w:t>
             </w:r>
           </w:p>
@@ -907,7 +1031,6 @@
       <w:pPr>
         <w:spacing w:before="40" w:after="80" w:line="276" w:lineRule="auto"/>
       </w:pPr>
-      <w:r/>
       <w:r>
         <w:rPr>
           <w:rFonts w:ascii="Consolas" w:hAnsi="Consolas"/>
@@ -951,7 +1074,6 @@
         <w:pStyle w:val="ListNumber"/>
         <w:spacing w:before="20" w:after="40"/>
       </w:pPr>
-      <w:r/>
       <w:r>
         <w:rPr>
           <w:b/>
@@ -959,7 +1081,19 @@
         <w:t>Global Weight State</w:t>
       </w:r>
       <w:r>
-        <w:t>: Maintains the global model parameter matrix $W \in \mathbb{R}^{10 \times 64}$.</w:t>
+        <w:t xml:space="preserve">: Maintains the global model parameter matrix </w:t>
+      </w:r>
+      <w:r>
+        <w:rPr>
+          <w:rFonts w:ascii="Cambria Math" w:hAnsi="Cambria Math"/>
+          <w:i/>
+          <w:color w:val="1A365D"/>
+          <w:sz w:val="21"/>
+        </w:rPr>
+        <w:t>‖W‖ ‖ ‖∈‖ ‖ ‖ℝ‖^‖{‖1‖0‖ ‖ ‖×‖ ‖ ‖6‖4‖}‖</w:t>
+      </w:r>
+      <w:r>
+        <w:t>.</w:t>
       </w:r>
     </w:p>
     <w:p>
@@ -967,7 +1101,6 @@
         <w:pStyle w:val="ListNumber"/>
         <w:spacing w:before="20" w:after="40"/>
       </w:pPr>
-      <w:r/>
       <w:r>
         <w:rPr>
           <w:b/>
@@ -1004,7 +1137,19 @@
         <w:spacing w:before="20" w:after="40"/>
       </w:pPr>
       <w:r>
-        <w:t>Collects privacy-perturbed gradient updates $\widetilde{\Delta W}_k$.</w:t>
+        <w:t xml:space="preserve">Collects privacy-perturbed gradient updates </w:t>
+      </w:r>
+      <w:r>
+        <w:rPr>
+          <w:rFonts w:ascii="Cambria Math" w:hAnsi="Cambria Math"/>
+          <w:i/>
+          <w:color w:val="1A365D"/>
+          <w:sz w:val="21"/>
+        </w:rPr>
+        <w:t>‖‖w‖i‖d‖e‖t‖i‖l‖d‖e‖{‖Δ‖ ‖W‖}‖_‖k‖</w:t>
+      </w:r>
+      <w:r>
+        <w:t>.</w:t>
       </w:r>
     </w:p>
     <w:p>
@@ -1016,20 +1161,45 @@
         <w:t>Computes sample-weighted average:</w:t>
       </w:r>
     </w:p>
-    <w:p>
-      <w:pPr>
-        <w:spacing w:before="40" w:after="80" w:line="276" w:lineRule="auto"/>
-      </w:pPr>
-      <w:r>
-        <w:t xml:space="preserve">     $$W_{\text{global}}^{(t+1)} = W_{\text{global}}^{(t)} + \sum_{k=1}^K \left( \frac{n_k}{\sum n_j} \right) \widetilde{\Delta W}_k$$</w:t>
-      </w:r>
-    </w:p>
+    <w:tbl>
+      <w:tblPr>
+        <w:tblW w:type="auto" w:w="0"/>
+        <w:tblLayout w:type="fixed"/>
+        <w:tblLook w:firstColumn="1" w:firstRow="1" w:lastColumn="0" w:lastRow="0" w:noHBand="0" w:noVBand="1" w:val="04A0"/>
+      </w:tblPr>
+      <w:tblGrid>
+        <w:gridCol w:w="9360"/>
+      </w:tblGrid>
+      <w:tr>
+        <w:tc>
+          <w:tcPr>
+            <w:tcW w:type="dxa" w:w="9360"/>
+            <w:shd w:fill="F0F4F8"/>
+          </w:tcPr>
+          <w:p>
+            <w:pPr>
+              <w:spacing w:before="160" w:after="160"/>
+              <w:jc w:val="center"/>
+            </w:pPr>
+            <w:r>
+              <w:rPr>
+                <w:rFonts w:ascii="Cambria Math" w:hAnsi="Cambria Math"/>
+                <w:b/>
+                <w:color w:val="1A365D"/>
+                <w:sz w:val="24"/>
+              </w:rPr>
+              <w:t>‖W‖_‖{‖g‖l‖o‖b‖a‖l‖}‖^‖{‖(‖t‖+‖1‖)‖}‖ ‖=‖ ‖W‖_‖{‖g‖l‖o‖b‖a‖l‖}‖^‖{‖(‖t‖)‖}‖ ‖+‖ ‖∑‖(‖k‖=‖1‖…‖K‖)‖ ‖ ‖≤‖ ‖f‖t‖(‖ ‖(‖n‖_‖k‖ ‖/‖ ‖∑‖ ‖n‖_‖j‖)‖ ‖‖r‖i‖g‖h‖t‖)‖ ‖‖w‖i‖d‖e‖t‖i‖l‖d‖e‖{‖Δ‖ ‖W‖}‖_‖k‖</w:t>
+            </w:r>
+          </w:p>
+        </w:tc>
+      </w:tr>
+    </w:tbl>
+    <w:p/>
     <w:p>
       <w:pPr>
         <w:pStyle w:val="ListNumber"/>
         <w:spacing w:before="20" w:after="40"/>
       </w:pPr>
-      <w:r/>
       <w:r>
         <w:rPr>
           <w:b/>
@@ -1037,7 +1207,19 @@
         <w:t>Multi-Ancestry Evaluation (`evaluate_global_model`)</w:t>
       </w:r>
       <w:r>
-        <w:t>: Evaluates the global model on a held-out test dataset ($N=600$) and breaks down performance across distinct populations:</w:t>
+        <w:t>: Evaluates the global model on a held-out test dataset (</w:t>
+      </w:r>
+      <w:r>
+        <w:rPr>
+          <w:rFonts w:ascii="Cambria Math" w:hAnsi="Cambria Math"/>
+          <w:i/>
+          <w:color w:val="1A365D"/>
+          <w:sz w:val="21"/>
+        </w:rPr>
+        <w:t>‖N‖=‖6‖0‖0‖</w:t>
+      </w:r>
+      <w:r>
+        <w:t>) and breaks down performance across distinct populations:</w:t>
       </w:r>
     </w:p>
     <w:p>
@@ -1045,7 +1227,6 @@
         <w:pStyle w:val="ListBullet"/>
         <w:spacing w:before="20" w:after="40"/>
       </w:pPr>
-      <w:r/>
       <w:r>
         <w:rPr>
           <w:b/>
@@ -1061,7 +1242,6 @@
         <w:pStyle w:val="ListBullet"/>
         <w:spacing w:before="20" w:after="40"/>
       </w:pPr>
-      <w:r/>
       <w:r>
         <w:rPr>
           <w:b/>
@@ -1077,7 +1257,6 @@
         <w:pStyle w:val="ListBullet"/>
         <w:spacing w:before="20" w:after="40"/>
       </w:pPr>
-      <w:r/>
       <w:r>
         <w:rPr>
           <w:b/>
@@ -1097,20 +1276,45 @@
         <w:t>Computes Loss, Raw Accuracy, and Balanced Accuracy:</w:t>
       </w:r>
     </w:p>
-    <w:p>
-      <w:pPr>
-        <w:spacing w:before="40" w:after="80" w:line="276" w:lineRule="auto"/>
-      </w:pPr>
-      <w:r>
-        <w:t xml:space="preserve">     $$\text{Balanced Accuracy} = \frac{\text{Sensitivity} + \text{Specificity}}{2}$$</w:t>
-      </w:r>
-    </w:p>
+    <w:tbl>
+      <w:tblPr>
+        <w:tblW w:type="auto" w:w="0"/>
+        <w:tblLayout w:type="fixed"/>
+        <w:tblLook w:firstColumn="1" w:firstRow="1" w:lastColumn="0" w:lastRow="0" w:noHBand="0" w:noVBand="1" w:val="04A0"/>
+      </w:tblPr>
+      <w:tblGrid>
+        <w:gridCol w:w="9360"/>
+      </w:tblGrid>
+      <w:tr>
+        <w:tc>
+          <w:tcPr>
+            <w:tcW w:type="dxa" w:w="9360"/>
+            <w:shd w:fill="F0F4F8"/>
+          </w:tcPr>
+          <w:p>
+            <w:pPr>
+              <w:spacing w:before="160" w:after="160"/>
+              <w:jc w:val="center"/>
+            </w:pPr>
+            <w:r>
+              <w:rPr>
+                <w:rFonts w:ascii="Cambria Math" w:hAnsi="Cambria Math"/>
+                <w:b/>
+                <w:color w:val="1A365D"/>
+                <w:sz w:val="24"/>
+              </w:rPr>
+              <w:t>‖B‖a‖l‖a‖n‖c‖e‖d‖ ‖A‖c‖c‖u‖r‖a‖c‖y‖ ‖=‖ ‖(‖S‖e‖n‖s‖i‖t‖i‖v‖i‖t‖y‖ ‖+‖ ‖S‖p‖e‖c‖i‖f‖i‖c‖i‖t‖y‖ ‖/‖ ‖2‖)‖</w:t>
+            </w:r>
+          </w:p>
+        </w:tc>
+      </w:tr>
+    </w:tbl>
+    <w:p/>
     <w:p>
       <w:pPr>
         <w:pStyle w:val="ListNumber"/>
         <w:spacing w:before="20" w:after="40"/>
       </w:pPr>
-      <w:r/>
       <w:r>
         <w:rPr>
           <w:b/>
@@ -1173,7 +1377,6 @@
       <w:pPr>
         <w:spacing w:before="40" w:after="80" w:line="276" w:lineRule="auto"/>
       </w:pPr>
-      <w:r/>
       <w:r>
         <w:rPr>
           <w:rFonts w:ascii="Consolas" w:hAnsi="Consolas"/>
@@ -1206,7 +1409,6 @@
         <w:pStyle w:val="ListNumber"/>
         <w:spacing w:before="20" w:after="40"/>
       </w:pPr>
-      <w:r/>
       <w:r>
         <w:rPr>
           <w:b/>
@@ -1223,7 +1425,19 @@
         <w:spacing w:before="20" w:after="40"/>
       </w:pPr>
       <w:r>
-        <w:t>Computes positive class weight $w_{\text{pos}} = \frac{N_{\text{neg}}}{N_{\text{pos}}}$ to prevent majority-class bias.</w:t>
+        <w:t xml:space="preserve">Computes positive class weight </w:t>
+      </w:r>
+      <w:r>
+        <w:rPr>
+          <w:rFonts w:ascii="Cambria Math" w:hAnsi="Cambria Math"/>
+          <w:i/>
+          <w:color w:val="1A365D"/>
+          <w:sz w:val="21"/>
+        </w:rPr>
+        <w:t>‖w‖_‖{‖p‖o‖s‖}‖ ‖=‖ ‖‖f‖r‖a‖c‖{‖N‖_‖{‖n‖e‖g‖}‖}‖{‖N‖_‖{‖p‖o‖s‖}‖}‖</w:t>
+      </w:r>
+      <w:r>
+        <w:t xml:space="preserve"> to prevent majority-class bias.</w:t>
       </w:r>
     </w:p>
     <w:p>
@@ -1232,7 +1446,19 @@
         <w:spacing w:before="20" w:after="40"/>
       </w:pPr>
       <w:r>
-        <w:t>Performs mini-batch Stochastic Gradient Descent (SGD) with L2 weight decay ($\lambda = 10^{-3}$) over local training data.</w:t>
+        <w:t>Performs mini-batch Stochastic Gradient Descent (SGD) with L2 weight decay (</w:t>
+      </w:r>
+      <w:r>
+        <w:rPr>
+          <w:rFonts w:ascii="Cambria Math" w:hAnsi="Cambria Math"/>
+          <w:i/>
+          <w:color w:val="1A365D"/>
+          <w:sz w:val="21"/>
+        </w:rPr>
+        <w:t>‖λ‖ ‖=‖ ‖1‖0‖^‖{‖-‖3‖}‖</w:t>
+      </w:r>
+      <w:r>
+        <w:t>) over local training data.</w:t>
       </w:r>
     </w:p>
     <w:p>
@@ -1240,7 +1466,6 @@
         <w:pStyle w:val="ListNumber"/>
         <w:spacing w:before="20" w:after="40"/>
       </w:pPr>
-      <w:r/>
       <w:r>
         <w:rPr>
           <w:b/>
@@ -1251,20 +1476,45 @@
         <w:t>:</w:t>
       </w:r>
     </w:p>
-    <w:p>
-      <w:pPr>
-        <w:spacing w:before="40" w:after="80" w:line="276" w:lineRule="auto"/>
-      </w:pPr>
-      <w:r>
-        <w:t xml:space="preserve">   $$\Delta W_{\text{local}} = W_{\text{local}}^{(\text{trained})} - W_{\text{global}}$$</w:t>
-      </w:r>
-    </w:p>
+    <w:tbl>
+      <w:tblPr>
+        <w:tblW w:type="auto" w:w="0"/>
+        <w:tblLayout w:type="fixed"/>
+        <w:tblLook w:firstColumn="1" w:firstRow="1" w:lastColumn="0" w:lastRow="0" w:noHBand="0" w:noVBand="1" w:val="04A0"/>
+      </w:tblPr>
+      <w:tblGrid>
+        <w:gridCol w:w="9360"/>
+      </w:tblGrid>
+      <w:tr>
+        <w:tc>
+          <w:tcPr>
+            <w:tcW w:type="dxa" w:w="9360"/>
+            <w:shd w:fill="F0F4F8"/>
+          </w:tcPr>
+          <w:p>
+            <w:pPr>
+              <w:spacing w:before="160" w:after="160"/>
+              <w:jc w:val="center"/>
+            </w:pPr>
+            <w:r>
+              <w:rPr>
+                <w:rFonts w:ascii="Cambria Math" w:hAnsi="Cambria Math"/>
+                <w:b/>
+                <w:color w:val="1A365D"/>
+                <w:sz w:val="24"/>
+              </w:rPr>
+              <w:t>‖Δ‖ ‖W‖_‖{‖l‖o‖c‖a‖l‖}‖ ‖=‖ ‖W‖_‖{‖l‖o‖c‖a‖l‖}‖^‖{‖(‖t‖r‖a‖i‖n‖e‖d‖)‖}‖ ‖-‖ ‖W‖_‖{‖g‖l‖o‖b‖a‖l‖}‖</w:t>
+            </w:r>
+          </w:p>
+        </w:tc>
+      </w:tr>
+    </w:tbl>
+    <w:p/>
     <w:p>
       <w:pPr>
         <w:pStyle w:val="ListNumber"/>
         <w:spacing w:before="20" w:after="40"/>
       </w:pPr>
-      <w:r/>
       <w:r>
         <w:rPr>
           <w:b/>
@@ -1283,7 +1533,19 @@
         <w:t>privacy_guard.add_laplace_noise_to_weights()</w:t>
       </w:r>
       <w:r>
-        <w:t xml:space="preserve"> to add calibrated Laplace noise to $\Delta W_{\text{local}}$ before returning it to the aggregator.</w:t>
+        <w:t xml:space="preserve"> to add calibrated Laplace noise to </w:t>
+      </w:r>
+      <w:r>
+        <w:rPr>
+          <w:rFonts w:ascii="Cambria Math" w:hAnsi="Cambria Math"/>
+          <w:i/>
+          <w:color w:val="1A365D"/>
+          <w:sz w:val="21"/>
+        </w:rPr>
+        <w:t>‖Δ‖ ‖W‖_‖{‖l‖o‖c‖a‖l‖}‖</w:t>
+      </w:r>
+      <w:r>
+        <w:t xml:space="preserve"> before returning it to the aggregator.</w:t>
       </w:r>
     </w:p>
     <w:p>
@@ -1316,7 +1578,6 @@
       <w:pPr>
         <w:spacing w:before="40" w:after="80" w:line="276" w:lineRule="auto"/>
       </w:pPr>
-      <w:r/>
       <w:r>
         <w:rPr>
           <w:rFonts w:ascii="Consolas" w:hAnsi="Consolas"/>
@@ -1371,7 +1632,6 @@
         <w:pStyle w:val="ListBullet"/>
         <w:spacing w:before="20" w:after="40"/>
       </w:pPr>
-      <w:r/>
       <w:r>
         <w:rPr>
           <w:rFonts w:ascii="Consolas" w:hAnsi="Consolas"/>
@@ -1390,7 +1650,31 @@
         <w:spacing w:before="20" w:after="40"/>
       </w:pPr>
       <w:r>
-        <w:t>Computes exact RDP order divergence $\mathcal{D}_\alpha$ across orders $\alpha \in [1.25, 64.0]$.</w:t>
+        <w:t xml:space="preserve">Computes exact RDP order divergence </w:t>
+      </w:r>
+      <w:r>
+        <w:rPr>
+          <w:rFonts w:ascii="Cambria Math" w:hAnsi="Cambria Math"/>
+          <w:i/>
+          <w:color w:val="1A365D"/>
+          <w:sz w:val="21"/>
+        </w:rPr>
+        <w:t>‖𝒟‖_‖α‖</w:t>
+      </w:r>
+      <w:r>
+        <w:t xml:space="preserve"> across orders </w:t>
+      </w:r>
+      <w:r>
+        <w:rPr>
+          <w:rFonts w:ascii="Cambria Math" w:hAnsi="Cambria Math"/>
+          <w:i/>
+          <w:color w:val="1A365D"/>
+          <w:sz w:val="21"/>
+        </w:rPr>
+        <w:t>‖α‖ ‖ ‖∈‖ ‖ ‖[‖1‖.‖2‖5‖,‖ ‖6‖4‖.‖0‖]‖</w:t>
+      </w:r>
+      <w:r>
+        <w:t>.</w:t>
       </w:r>
     </w:p>
     <w:p>
@@ -1399,7 +1683,19 @@
         <w:spacing w:before="20" w:after="40"/>
       </w:pPr>
       <w:r>
-        <w:t>Composes RDP across multiple training rounds: $\mathcal{D}_\alpha^{(T)} = \sum \mathcal{D}_\alpha^{(t)}$.</w:t>
+        <w:t xml:space="preserve">Composes RDP across multiple training rounds: </w:t>
+      </w:r>
+      <w:r>
+        <w:rPr>
+          <w:rFonts w:ascii="Cambria Math" w:hAnsi="Cambria Math"/>
+          <w:i/>
+          <w:color w:val="1A365D"/>
+          <w:sz w:val="21"/>
+        </w:rPr>
+        <w:t>‖𝒟‖_‖α‖^‖{‖(‖T‖)‖}‖ ‖=‖ ‖∑‖ ‖𝒟‖_‖α‖^‖{‖(‖t‖)‖}‖</w:t>
+      </w:r>
+      <w:r>
+        <w:t>.</w:t>
       </w:r>
     </w:p>
     <w:p>
@@ -1408,23 +1704,60 @@
         <w:spacing w:before="20" w:after="40"/>
       </w:pPr>
       <w:r>
-        <w:t>Converts composed RDP to standard $(\epsilon, \delta)$-DP bounds via:</w:t>
+        <w:t xml:space="preserve">Converts composed RDP to standard </w:t>
+      </w:r>
+      <w:r>
+        <w:rPr>
+          <w:rFonts w:ascii="Cambria Math" w:hAnsi="Cambria Math"/>
+          <w:i/>
+          <w:color w:val="1A365D"/>
+          <w:sz w:val="21"/>
+        </w:rPr>
+        <w:t>‖(‖ε‖,‖ ‖δ‖)‖</w:t>
+      </w:r>
+      <w:r>
+        <w:t>-DP bounds via:</w:t>
       </w:r>
     </w:p>
-    <w:p>
-      <w:pPr>
-        <w:spacing w:before="40" w:after="80" w:line="276" w:lineRule="auto"/>
-      </w:pPr>
-      <w:r>
-        <w:t xml:space="preserve">    $$\epsilon(\delta) = \min_{\alpha &gt; 1} \left[ \mathcal{D}_\alpha^{(T)} + \frac{\ln(1/\delta)}{\alpha - 1} \right]$$</w:t>
-      </w:r>
-    </w:p>
+    <w:tbl>
+      <w:tblPr>
+        <w:tblW w:type="auto" w:w="0"/>
+        <w:tblLayout w:type="fixed"/>
+        <w:tblLook w:firstColumn="1" w:firstRow="1" w:lastColumn="0" w:lastRow="0" w:noHBand="0" w:noVBand="1" w:val="04A0"/>
+      </w:tblPr>
+      <w:tblGrid>
+        <w:gridCol w:w="9360"/>
+      </w:tblGrid>
+      <w:tr>
+        <w:tc>
+          <w:tcPr>
+            <w:tcW w:type="dxa" w:w="9360"/>
+            <w:shd w:fill="F0F4F8"/>
+          </w:tcPr>
+          <w:p>
+            <w:pPr>
+              <w:spacing w:before="160" w:after="160"/>
+              <w:jc w:val="center"/>
+            </w:pPr>
+            <w:r>
+              <w:rPr>
+                <w:rFonts w:ascii="Cambria Math" w:hAnsi="Cambria Math"/>
+                <w:b/>
+                <w:color w:val="1A365D"/>
+                <w:sz w:val="24"/>
+              </w:rPr>
+              <w:t>‖ε‖(‖δ‖)‖ ‖=‖ ‖‖m‖i‖n‖_‖{‖α‖ ‖&gt;‖ ‖1‖}‖ ‖ ‖≤‖ ‖f‖t‖[‖ ‖𝒟‖_‖α‖^‖{‖(‖T‖)‖}‖ ‖+‖ ‖(‖‖l‖n‖(‖1‖/‖δ‖)‖ ‖/‖ ‖α‖ ‖-‖ ‖1‖)‖ ‖‖r‖i‖g‖h‖t‖]‖</w:t>
+            </w:r>
+          </w:p>
+        </w:tc>
+      </w:tr>
+    </w:tbl>
+    <w:p/>
     <w:p>
       <w:pPr>
         <w:pStyle w:val="ListBullet"/>
         <w:spacing w:before="20" w:after="40"/>
       </w:pPr>
-      <w:r/>
       <w:r>
         <w:rPr>
           <w:rFonts w:ascii="Consolas" w:hAnsi="Consolas"/>
@@ -1443,7 +1776,31 @@
         <w:spacing w:before="20" w:after="40"/>
       </w:pPr>
       <w:r>
-        <w:t>Applies zero-mean Laplace noise: $\text{Laplace}\left(0, \frac{\Delta_S}{\epsilon_{\text{step}}}\right)$ with sensitivity $\Delta_S = 0.2$.</w:t>
+        <w:t xml:space="preserve">Applies zero-mean Laplace noise: </w:t>
+      </w:r>
+      <w:r>
+        <w:rPr>
+          <w:rFonts w:ascii="Cambria Math" w:hAnsi="Cambria Math"/>
+          <w:i/>
+          <w:color w:val="1A365D"/>
+          <w:sz w:val="21"/>
+        </w:rPr>
+        <w:t>‖L‖a‖p‖l‖a‖c‖e‖ ‖≤‖ ‖f‖t‖(‖0‖,‖ ‖‖f‖r‖a‖c‖{‖Δ‖_‖S‖}‖{‖ε‖_‖{‖s‖t‖e‖p‖}‖}‖‖r‖i‖g‖h‖t‖)‖</w:t>
+      </w:r>
+      <w:r>
+        <w:t xml:space="preserve"> with sensitivity </w:t>
+      </w:r>
+      <w:r>
+        <w:rPr>
+          <w:rFonts w:ascii="Cambria Math" w:hAnsi="Cambria Math"/>
+          <w:i/>
+          <w:color w:val="1A365D"/>
+          <w:sz w:val="21"/>
+        </w:rPr>
+        <w:t>‖Δ‖_‖S‖ ‖=‖ ‖0‖.‖2‖</w:t>
+      </w:r>
+      <w:r>
+        <w:t>.</w:t>
       </w:r>
     </w:p>
     <w:p>
@@ -1452,7 +1809,19 @@
         <w:spacing w:before="20" w:after="40"/>
       </w:pPr>
       <w:r>
-        <w:t>Enforces hard privacy budget limits (default $\epsilon_{\text{total}} = 10.0, \delta = 10^{-5}$).</w:t>
+        <w:t xml:space="preserve">Enforces hard privacy budget limits (default </w:t>
+      </w:r>
+      <w:r>
+        <w:rPr>
+          <w:rFonts w:ascii="Cambria Math" w:hAnsi="Cambria Math"/>
+          <w:i/>
+          <w:color w:val="1A365D"/>
+          <w:sz w:val="21"/>
+        </w:rPr>
+        <w:t>‖ε‖_‖{‖t‖o‖t‖a‖l‖}‖ ‖=‖ ‖1‖0‖.‖0‖,‖ ‖δ‖ ‖=‖ ‖1‖0‖^‖{‖-‖5‖}‖</w:t>
+      </w:r>
+      <w:r>
+        <w:t>).</w:t>
       </w:r>
     </w:p>
     <w:p>
@@ -1485,7 +1854,6 @@
       <w:pPr>
         <w:spacing w:before="40" w:after="80" w:line="276" w:lineRule="auto"/>
       </w:pPr>
-      <w:r/>
       <w:r>
         <w:rPr>
           <w:rFonts w:ascii="Consolas" w:hAnsi="Consolas"/>
@@ -1657,7 +2025,14 @@
               <w:rPr>
                 <w:sz w:val="19"/>
               </w:rPr>
-              <w:t>`rs1799966`</w:t>
+            </w:r>
+            <w:r>
+              <w:rPr>
+                <w:rFonts w:ascii="Consolas" w:hAnsi="Consolas"/>
+                <w:color w:val="805AD5"/>
+                <w:sz w:val="19"/>
+              </w:rPr>
+              <w:t>rs1799966</w:t>
             </w:r>
           </w:p>
         </w:tc>
@@ -1670,6 +2045,11 @@
             <w:pPr>
               <w:spacing w:before="60" w:after="60"/>
             </w:pPr>
+            <w:r>
+              <w:rPr>
+                <w:sz w:val="19"/>
+              </w:rPr>
+            </w:r>
             <w:r>
               <w:rPr>
                 <w:sz w:val="19"/>
@@ -1691,6 +2071,11 @@
               <w:rPr>
                 <w:sz w:val="19"/>
               </w:rPr>
+            </w:r>
+            <w:r>
+              <w:rPr>
+                <w:sz w:val="19"/>
+              </w:rPr>
               <w:t>chr17:43045677</w:t>
             </w:r>
           </w:p>
@@ -1704,6 +2089,11 @@
             <w:pPr>
               <w:spacing w:before="60" w:after="60"/>
             </w:pPr>
+            <w:r>
+              <w:rPr>
+                <w:sz w:val="19"/>
+              </w:rPr>
+            </w:r>
             <w:r>
               <w:rPr>
                 <w:sz w:val="19"/>
@@ -1725,6 +2115,11 @@
               <w:rPr>
                 <w:sz w:val="19"/>
               </w:rPr>
+            </w:r>
+            <w:r>
+              <w:rPr>
+                <w:sz w:val="19"/>
+              </w:rPr>
               <w:t>Monogenic</w:t>
             </w:r>
           </w:p>
@@ -1738,6 +2133,11 @@
             <w:pPr>
               <w:spacing w:before="60" w:after="60"/>
             </w:pPr>
+            <w:r>
+              <w:rPr>
+                <w:sz w:val="19"/>
+              </w:rPr>
+            </w:r>
             <w:r>
               <w:rPr>
                 <w:sz w:val="19"/>
@@ -1761,7 +2161,14 @@
               <w:rPr>
                 <w:sz w:val="19"/>
               </w:rPr>
-              <w:t>`rs80357711`</w:t>
+            </w:r>
+            <w:r>
+              <w:rPr>
+                <w:rFonts w:ascii="Consolas" w:hAnsi="Consolas"/>
+                <w:color w:val="805AD5"/>
+                <w:sz w:val="19"/>
+              </w:rPr>
+              <w:t>rs80357711</w:t>
             </w:r>
           </w:p>
         </w:tc>
@@ -1774,6 +2181,11 @@
             <w:pPr>
               <w:spacing w:before="60" w:after="60"/>
             </w:pPr>
+            <w:r>
+              <w:rPr>
+                <w:sz w:val="19"/>
+              </w:rPr>
+            </w:r>
             <w:r>
               <w:rPr>
                 <w:sz w:val="19"/>
@@ -1795,6 +2207,11 @@
               <w:rPr>
                 <w:sz w:val="19"/>
               </w:rPr>
+            </w:r>
+            <w:r>
+              <w:rPr>
+                <w:sz w:val="19"/>
+              </w:rPr>
               <w:t>chr17:43057062</w:t>
             </w:r>
           </w:p>
@@ -1808,6 +2225,11 @@
             <w:pPr>
               <w:spacing w:before="60" w:after="60"/>
             </w:pPr>
+            <w:r>
+              <w:rPr>
+                <w:sz w:val="19"/>
+              </w:rPr>
+            </w:r>
             <w:r>
               <w:rPr>
                 <w:sz w:val="19"/>
@@ -1829,6 +2251,11 @@
               <w:rPr>
                 <w:sz w:val="19"/>
               </w:rPr>
+            </w:r>
+            <w:r>
+              <w:rPr>
+                <w:sz w:val="19"/>
+              </w:rPr>
               <w:t>Monogenic</w:t>
             </w:r>
           </w:p>
@@ -1842,6 +2269,11 @@
             <w:pPr>
               <w:spacing w:before="60" w:after="60"/>
             </w:pPr>
+            <w:r>
+              <w:rPr>
+                <w:sz w:val="19"/>
+              </w:rPr>
+            </w:r>
             <w:r>
               <w:rPr>
                 <w:sz w:val="19"/>
@@ -1865,7 +2297,14 @@
               <w:rPr>
                 <w:sz w:val="19"/>
               </w:rPr>
-              <w:t>`rs7903146`</w:t>
+            </w:r>
+            <w:r>
+              <w:rPr>
+                <w:rFonts w:ascii="Consolas" w:hAnsi="Consolas"/>
+                <w:color w:val="805AD5"/>
+                <w:sz w:val="19"/>
+              </w:rPr>
+              <w:t>rs7903146</w:t>
             </w:r>
           </w:p>
         </w:tc>
@@ -1878,6 +2317,11 @@
             <w:pPr>
               <w:spacing w:before="60" w:after="60"/>
             </w:pPr>
+            <w:r>
+              <w:rPr>
+                <w:sz w:val="19"/>
+              </w:rPr>
+            </w:r>
             <w:r>
               <w:rPr>
                 <w:sz w:val="19"/>
@@ -1899,6 +2343,11 @@
               <w:rPr>
                 <w:sz w:val="19"/>
               </w:rPr>
+            </w:r>
+            <w:r>
+              <w:rPr>
+                <w:sz w:val="19"/>
+              </w:rPr>
               <w:t>chr10:112998590</w:t>
             </w:r>
           </w:p>
@@ -1912,6 +2361,11 @@
             <w:pPr>
               <w:spacing w:before="60" w:after="60"/>
             </w:pPr>
+            <w:r>
+              <w:rPr>
+                <w:sz w:val="19"/>
+              </w:rPr>
+            </w:r>
             <w:r>
               <w:rPr>
                 <w:sz w:val="19"/>
@@ -1933,6 +2387,11 @@
               <w:rPr>
                 <w:sz w:val="19"/>
               </w:rPr>
+            </w:r>
+            <w:r>
+              <w:rPr>
+                <w:sz w:val="19"/>
+              </w:rPr>
               <w:t>Polygenic</w:t>
             </w:r>
           </w:p>
@@ -1950,7 +2409,15 @@
               <w:rPr>
                 <w:sz w:val="19"/>
               </w:rPr>
-              <w:t>$\beta = 0.65$</w:t>
+            </w:r>
+            <w:r>
+              <w:rPr>
+                <w:rFonts w:ascii="Cambria Math" w:hAnsi="Cambria Math"/>
+                <w:i/>
+                <w:color w:val="1A365D"/>
+                <w:sz w:val="21"/>
+              </w:rPr>
+              <w:t>‖β‖ ‖=‖ ‖0‖.‖6‖5‖</w:t>
             </w:r>
           </w:p>
         </w:tc>
@@ -1969,7 +2436,14 @@
               <w:rPr>
                 <w:sz w:val="19"/>
               </w:rPr>
-              <w:t>`rs429358`</w:t>
+            </w:r>
+            <w:r>
+              <w:rPr>
+                <w:rFonts w:ascii="Consolas" w:hAnsi="Consolas"/>
+                <w:color w:val="805AD5"/>
+                <w:sz w:val="19"/>
+              </w:rPr>
+              <w:t>rs429358</w:t>
             </w:r>
           </w:p>
         </w:tc>
@@ -1982,6 +2456,11 @@
             <w:pPr>
               <w:spacing w:before="60" w:after="60"/>
             </w:pPr>
+            <w:r>
+              <w:rPr>
+                <w:sz w:val="19"/>
+              </w:rPr>
+            </w:r>
             <w:r>
               <w:rPr>
                 <w:sz w:val="19"/>
@@ -2003,6 +2482,11 @@
               <w:rPr>
                 <w:sz w:val="19"/>
               </w:rPr>
+            </w:r>
+            <w:r>
+              <w:rPr>
+                <w:sz w:val="19"/>
+              </w:rPr>
               <w:t>chr19:44908684</w:t>
             </w:r>
           </w:p>
@@ -2016,6 +2500,11 @@
             <w:pPr>
               <w:spacing w:before="60" w:after="60"/>
             </w:pPr>
+            <w:r>
+              <w:rPr>
+                <w:sz w:val="19"/>
+              </w:rPr>
+            </w:r>
             <w:r>
               <w:rPr>
                 <w:sz w:val="19"/>
@@ -2037,6 +2526,11 @@
               <w:rPr>
                 <w:sz w:val="19"/>
               </w:rPr>
+            </w:r>
+            <w:r>
+              <w:rPr>
+                <w:sz w:val="19"/>
+              </w:rPr>
               <w:t>Polygenic</w:t>
             </w:r>
           </w:p>
@@ -2054,7 +2548,15 @@
               <w:rPr>
                 <w:sz w:val="19"/>
               </w:rPr>
-              <w:t>$\beta = 0.85$</w:t>
+            </w:r>
+            <w:r>
+              <w:rPr>
+                <w:rFonts w:ascii="Cambria Math" w:hAnsi="Cambria Math"/>
+                <w:i/>
+                <w:color w:val="1A365D"/>
+                <w:sz w:val="21"/>
+              </w:rPr>
+              <w:t>‖β‖ ‖=‖ ‖0‖.‖8‖5‖</w:t>
             </w:r>
           </w:p>
         </w:tc>
@@ -2073,7 +2575,14 @@
               <w:rPr>
                 <w:sz w:val="19"/>
               </w:rPr>
-              <w:t>`rs1042522`</w:t>
+            </w:r>
+            <w:r>
+              <w:rPr>
+                <w:rFonts w:ascii="Consolas" w:hAnsi="Consolas"/>
+                <w:color w:val="805AD5"/>
+                <w:sz w:val="19"/>
+              </w:rPr>
+              <w:t>rs1042522</w:t>
             </w:r>
           </w:p>
         </w:tc>
@@ -2086,6 +2595,11 @@
             <w:pPr>
               <w:spacing w:before="60" w:after="60"/>
             </w:pPr>
+            <w:r>
+              <w:rPr>
+                <w:sz w:val="19"/>
+              </w:rPr>
+            </w:r>
             <w:r>
               <w:rPr>
                 <w:sz w:val="19"/>
@@ -2107,6 +2621,11 @@
               <w:rPr>
                 <w:sz w:val="19"/>
               </w:rPr>
+            </w:r>
+            <w:r>
+              <w:rPr>
+                <w:sz w:val="19"/>
+              </w:rPr>
               <w:t>chr17:7676154</w:t>
             </w:r>
           </w:p>
@@ -2120,6 +2639,11 @@
             <w:pPr>
               <w:spacing w:before="60" w:after="60"/>
             </w:pPr>
+            <w:r>
+              <w:rPr>
+                <w:sz w:val="19"/>
+              </w:rPr>
+            </w:r>
             <w:r>
               <w:rPr>
                 <w:sz w:val="19"/>
@@ -2141,6 +2665,11 @@
               <w:rPr>
                 <w:sz w:val="19"/>
               </w:rPr>
+            </w:r>
+            <w:r>
+              <w:rPr>
+                <w:sz w:val="19"/>
+              </w:rPr>
               <w:t>Monogenic</w:t>
             </w:r>
           </w:p>
@@ -2158,6 +2687,11 @@
               <w:rPr>
                 <w:sz w:val="19"/>
               </w:rPr>
+            </w:r>
+            <w:r>
+              <w:rPr>
+                <w:sz w:val="19"/>
+              </w:rPr>
               <w:t>Clinical finding</w:t>
             </w:r>
           </w:p>
@@ -2185,7 +2719,6 @@
         <w:pStyle w:val="ListBullet"/>
         <w:spacing w:before="20" w:after="40"/>
       </w:pPr>
-      <w:r/>
       <w:r>
         <w:rPr>
           <w:rFonts w:ascii="Consolas" w:hAnsi="Consolas"/>
@@ -2225,7 +2758,6 @@
         <w:pStyle w:val="ListBullet"/>
         <w:spacing w:before="20" w:after="40"/>
       </w:pPr>
-      <w:r/>
       <w:r>
         <w:rPr>
           <w:rFonts w:ascii="Consolas" w:hAnsi="Consolas"/>
@@ -2235,7 +2767,19 @@
         <w:t>calculate_prs_percentile(polygenic_features, weights, ref_dist)</w:t>
       </w:r>
       <w:r>
-        <w:t>: Computes raw PRS using published GWAS effect weights and determines the exact population percentile ($0-100\%$) against an empirical distribution of 2,800 reference samples.</w:t>
+        <w:t>: Computes raw PRS using published GWAS effect weights and determines the exact population percentile (</w:t>
+      </w:r>
+      <w:r>
+        <w:rPr>
+          <w:rFonts w:ascii="Cambria Math" w:hAnsi="Cambria Math"/>
+          <w:i/>
+          <w:color w:val="1A365D"/>
+          <w:sz w:val="21"/>
+        </w:rPr>
+        <w:t>‖0‖-‖1‖0‖0‖‖%‖</w:t>
+      </w:r>
+      <w:r>
+        <w:t>) against an empirical distribution of 2,800 reference samples.</w:t>
       </w:r>
     </w:p>
     <w:p>
@@ -2347,7 +2891,6 @@
       <w:pPr>
         <w:spacing w:before="40" w:after="80" w:line="276" w:lineRule="auto"/>
       </w:pPr>
-      <w:r/>
       <w:r>
         <w:rPr>
           <w:rFonts w:ascii="Consolas" w:hAnsi="Consolas"/>
@@ -2365,7 +2908,6 @@
         <w:pStyle w:val="ListBullet"/>
         <w:spacing w:before="20" w:after="40"/>
       </w:pPr>
-      <w:r/>
       <w:r>
         <w:rPr>
           <w:rFonts w:ascii="Consolas" w:hAnsi="Consolas"/>
@@ -2394,7 +2936,6 @@
         <w:pStyle w:val="ListBullet"/>
         <w:spacing w:before="20" w:after="40"/>
       </w:pPr>
-      <w:r/>
       <w:r>
         <w:rPr>
           <w:rFonts w:ascii="Consolas" w:hAnsi="Consolas"/>
@@ -2437,7 +2978,6 @@
       <w:pPr>
         <w:spacing w:before="40" w:after="80" w:line="276" w:lineRule="auto"/>
       </w:pPr>
-      <w:r/>
       <w:r>
         <w:rPr>
           <w:rFonts w:ascii="Consolas" w:hAnsi="Consolas"/>
@@ -2479,7 +3019,6 @@
         <w:pStyle w:val="ListNumber"/>
         <w:spacing w:before="20" w:after="40"/>
       </w:pPr>
-      <w:r/>
       <w:r>
         <w:rPr>
           <w:b/>
@@ -2487,7 +3026,43 @@
         <w:t>Small-Cell Suppression ($k$-Anonymity)</w:t>
       </w:r>
       <w:r>
-        <w:t>: Any hospital node with between $1$ and $4$ matching patients returns $0$ to prevent patient re-identification.</w:t>
+        <w:t xml:space="preserve">: Any hospital node with between </w:t>
+      </w:r>
+      <w:r>
+        <w:rPr>
+          <w:rFonts w:ascii="Cambria Math" w:hAnsi="Cambria Math"/>
+          <w:i/>
+          <w:color w:val="1A365D"/>
+          <w:sz w:val="21"/>
+        </w:rPr>
+        <w:t>‖1‖</w:t>
+      </w:r>
+      <w:r>
+        <w:t xml:space="preserve"> and </w:t>
+      </w:r>
+      <w:r>
+        <w:rPr>
+          <w:rFonts w:ascii="Cambria Math" w:hAnsi="Cambria Math"/>
+          <w:i/>
+          <w:color w:val="1A365D"/>
+          <w:sz w:val="21"/>
+        </w:rPr>
+        <w:t>‖4‖</w:t>
+      </w:r>
+      <w:r>
+        <w:t xml:space="preserve"> matching patients returns </w:t>
+      </w:r>
+      <w:r>
+        <w:rPr>
+          <w:rFonts w:ascii="Cambria Math" w:hAnsi="Cambria Math"/>
+          <w:i/>
+          <w:color w:val="1A365D"/>
+          <w:sz w:val="21"/>
+        </w:rPr>
+        <w:t>‖0‖</w:t>
+      </w:r>
+      <w:r>
+        <w:t xml:space="preserve"> to prevent patient re-identification.</w:t>
       </w:r>
     </w:p>
     <w:p>
@@ -2496,7 +3071,19 @@
         <w:spacing w:before="20" w:after="40"/>
       </w:pPr>
       <w:r>
-        <w:t>Aggregator sums the safe node counts and computes estimated statistical power ($1 - \beta$).</w:t>
+        <w:t>Aggregator sums the safe node counts and computes estimated statistical power (</w:t>
+      </w:r>
+      <w:r>
+        <w:rPr>
+          <w:rFonts w:ascii="Cambria Math" w:hAnsi="Cambria Math"/>
+          <w:i/>
+          <w:color w:val="1A365D"/>
+          <w:sz w:val="21"/>
+        </w:rPr>
+        <w:t>‖1‖ ‖-‖ ‖β‖</w:t>
+      </w:r>
+      <w:r>
+        <w:t>).</w:t>
       </w:r>
     </w:p>
     <w:p>
@@ -2504,7 +3091,6 @@
         <w:pStyle w:val="ListNumber"/>
         <w:spacing w:before="20" w:after="40"/>
       </w:pPr>
-      <w:r/>
       <w:r>
         <w:rPr>
           <w:b/>
@@ -2591,7 +3177,6 @@
         <w:pStyle w:val="ListBullet"/>
         <w:spacing w:before="20" w:after="40"/>
       </w:pPr>
-      <w:r/>
       <w:r>
         <w:rPr>
           <w:b/>
@@ -2609,14 +3194,12 @@
         </w:rPr>
         <w:t>/</w:t>
       </w:r>
-      <w:r/>
     </w:p>
     <w:p>
       <w:pPr>
         <w:pStyle w:val="ListBullet"/>
         <w:spacing w:before="20" w:after="40"/>
       </w:pPr>
-      <w:r/>
       <w:r>
         <w:rPr>
           <w:b/>
@@ -2634,14 +3217,12 @@
         </w:rPr>
         <w:t>GET</w:t>
       </w:r>
-      <w:r/>
     </w:p>
     <w:p>
       <w:pPr>
         <w:pStyle w:val="ListBullet"/>
         <w:spacing w:before="20" w:after="40"/>
       </w:pPr>
-      <w:r/>
       <w:r>
         <w:rPr>
           <w:b/>
@@ -2657,7 +3238,6 @@
         <w:pStyle w:val="ListBullet"/>
         <w:spacing w:before="20" w:after="40"/>
       </w:pPr>
-      <w:r/>
       <w:r>
         <w:rPr>
           <w:b/>
@@ -2673,7 +3253,6 @@
         <w:pStyle w:val="ListBullet"/>
         <w:spacing w:before="20" w:after="40"/>
       </w:pPr>
-      <w:r/>
       <w:r>
         <w:rPr>
           <w:b/>
@@ -2779,7 +3358,6 @@
         <w:pStyle w:val="ListBullet"/>
         <w:spacing w:before="20" w:after="40"/>
       </w:pPr>
-      <w:r/>
       <w:r>
         <w:rPr>
           <w:b/>
@@ -2797,14 +3375,12 @@
         </w:rPr>
         <w:t>/auth/login</w:t>
       </w:r>
-      <w:r/>
     </w:p>
     <w:p>
       <w:pPr>
         <w:pStyle w:val="ListBullet"/>
         <w:spacing w:before="20" w:after="40"/>
       </w:pPr>
-      <w:r/>
       <w:r>
         <w:rPr>
           <w:b/>
@@ -2822,14 +3398,12 @@
         </w:rPr>
         <w:t>POST</w:t>
       </w:r>
-      <w:r/>
     </w:p>
     <w:p>
       <w:pPr>
         <w:pStyle w:val="ListBullet"/>
         <w:spacing w:before="20" w:after="40"/>
       </w:pPr>
-      <w:r/>
       <w:r>
         <w:rPr>
           <w:b/>
@@ -2845,7 +3419,6 @@
         <w:pStyle w:val="ListBullet"/>
         <w:spacing w:before="20" w:after="40"/>
       </w:pPr>
-      <w:r/>
       <w:r>
         <w:rPr>
           <w:b/>
@@ -2861,7 +3434,6 @@
         <w:pStyle w:val="ListBullet"/>
         <w:spacing w:before="20" w:after="40"/>
       </w:pPr>
-      <w:r/>
       <w:r>
         <w:rPr>
           <w:b/>
@@ -2915,7 +3487,6 @@
         <w:pStyle w:val="ListBullet"/>
         <w:spacing w:before="20" w:after="40"/>
       </w:pPr>
-      <w:r/>
       <w:r>
         <w:rPr>
           <w:b/>
@@ -2981,7 +3552,6 @@
         <w:pStyle w:val="ListBullet"/>
         <w:spacing w:before="20" w:after="40"/>
       </w:pPr>
-      <w:r/>
       <w:r>
         <w:rPr>
           <w:b/>
@@ -2997,7 +3567,6 @@
         <w:pStyle w:val="ListBullet"/>
         <w:spacing w:before="20" w:after="40"/>
       </w:pPr>
-      <w:r/>
       <w:r>
         <w:rPr>
           <w:rFonts w:ascii="Consolas" w:hAnsi="Consolas"/>
@@ -3041,7 +3610,6 @@
         <w:pStyle w:val="ListBullet"/>
         <w:spacing w:before="20" w:after="40"/>
       </w:pPr>
-      <w:r/>
       <w:r>
         <w:rPr>
           <w:b/>
@@ -3059,14 +3627,12 @@
         </w:rPr>
         <w:t>/api/fl/run-round</w:t>
       </w:r>
-      <w:r/>
     </w:p>
     <w:p>
       <w:pPr>
         <w:pStyle w:val="ListBullet"/>
         <w:spacing w:before="20" w:after="40"/>
       </w:pPr>
-      <w:r/>
       <w:r>
         <w:rPr>
           <w:b/>
@@ -3084,14 +3650,12 @@
         </w:rPr>
         <w:t>POST</w:t>
       </w:r>
-      <w:r/>
     </w:p>
     <w:p>
       <w:pPr>
         <w:pStyle w:val="ListBullet"/>
         <w:spacing w:before="20" w:after="40"/>
       </w:pPr>
-      <w:r/>
       <w:r>
         <w:rPr>
           <w:b/>
@@ -3107,7 +3671,6 @@
         <w:pStyle w:val="ListBullet"/>
         <w:spacing w:before="20" w:after="40"/>
       </w:pPr>
-      <w:r/>
       <w:r>
         <w:rPr>
           <w:b/>
@@ -3123,7 +3686,6 @@
         <w:pStyle w:val="ListBullet"/>
         <w:spacing w:before="20" w:after="40"/>
       </w:pPr>
-      <w:r/>
       <w:r>
         <w:rPr>
           <w:b/>
@@ -3179,7 +3741,6 @@
         <w:pStyle w:val="ListBullet"/>
         <w:spacing w:before="20" w:after="40"/>
       </w:pPr>
-      <w:r/>
       <w:r>
         <w:rPr>
           <w:b/>
@@ -3305,7 +3866,6 @@
         <w:pStyle w:val="ListBullet"/>
         <w:spacing w:before="20" w:after="40"/>
       </w:pPr>
-      <w:r/>
       <w:r>
         <w:rPr>
           <w:b/>
@@ -3323,14 +3883,12 @@
         </w:rPr>
         <w:t>/api/fl/history</w:t>
       </w:r>
-      <w:r/>
     </w:p>
     <w:p>
       <w:pPr>
         <w:pStyle w:val="ListBullet"/>
         <w:spacing w:before="20" w:after="40"/>
       </w:pPr>
-      <w:r/>
       <w:r>
         <w:rPr>
           <w:b/>
@@ -3348,14 +3906,12 @@
         </w:rPr>
         <w:t>GET</w:t>
       </w:r>
-      <w:r/>
     </w:p>
     <w:p>
       <w:pPr>
         <w:pStyle w:val="ListBullet"/>
         <w:spacing w:before="20" w:after="40"/>
       </w:pPr>
-      <w:r/>
       <w:r>
         <w:rPr>
           <w:b/>
@@ -3371,7 +3927,6 @@
         <w:pStyle w:val="ListBullet"/>
         <w:spacing w:before="20" w:after="40"/>
       </w:pPr>
-      <w:r/>
       <w:r>
         <w:rPr>
           <w:b/>
@@ -3387,7 +3942,6 @@
         <w:pStyle w:val="ListBullet"/>
         <w:spacing w:before="20" w:after="40"/>
       </w:pPr>
-      <w:r/>
       <w:r>
         <w:rPr>
           <w:b/>
@@ -3467,7 +4021,6 @@
         <w:pStyle w:val="ListBullet"/>
         <w:spacing w:before="20" w:after="40"/>
       </w:pPr>
-      <w:r/>
       <w:r>
         <w:rPr>
           <w:b/>
@@ -3485,14 +4038,12 @@
         </w:rPr>
         <w:t>/api/fl/predict</w:t>
       </w:r>
-      <w:r/>
     </w:p>
     <w:p>
       <w:pPr>
         <w:pStyle w:val="ListBullet"/>
         <w:spacing w:before="20" w:after="40"/>
       </w:pPr>
-      <w:r/>
       <w:r>
         <w:rPr>
           <w:b/>
@@ -3510,14 +4061,12 @@
         </w:rPr>
         <w:t>POST</w:t>
       </w:r>
-      <w:r/>
     </w:p>
     <w:p>
       <w:pPr>
         <w:pStyle w:val="ListBullet"/>
         <w:spacing w:before="20" w:after="40"/>
       </w:pPr>
-      <w:r/>
       <w:r>
         <w:rPr>
           <w:b/>
@@ -3533,7 +4082,6 @@
         <w:pStyle w:val="ListBullet"/>
         <w:spacing w:before="20" w:after="40"/>
       </w:pPr>
-      <w:r/>
       <w:r>
         <w:rPr>
           <w:b/>
@@ -3549,7 +4097,6 @@
         <w:pStyle w:val="ListBullet"/>
         <w:spacing w:before="20" w:after="40"/>
       </w:pPr>
-      <w:r/>
       <w:r>
         <w:rPr>
           <w:b/>
@@ -3609,7 +4156,6 @@
         <w:pStyle w:val="ListBullet"/>
         <w:spacing w:before="20" w:after="40"/>
       </w:pPr>
-      <w:r/>
       <w:r>
         <w:rPr>
           <w:b/>
@@ -3721,7 +4267,6 @@
         <w:pStyle w:val="ListBullet"/>
         <w:spacing w:before="20" w:after="40"/>
       </w:pPr>
-      <w:r/>
       <w:r>
         <w:rPr>
           <w:b/>
@@ -3739,14 +4284,12 @@
         </w:rPr>
         <w:t>/api/fl/model-inspect</w:t>
       </w:r>
-      <w:r/>
     </w:p>
     <w:p>
       <w:pPr>
         <w:pStyle w:val="ListBullet"/>
         <w:spacing w:before="20" w:after="40"/>
       </w:pPr>
-      <w:r/>
       <w:r>
         <w:rPr>
           <w:b/>
@@ -3764,14 +4307,12 @@
         </w:rPr>
         <w:t>GET</w:t>
       </w:r>
-      <w:r/>
     </w:p>
     <w:p>
       <w:pPr>
         <w:pStyle w:val="ListBullet"/>
         <w:spacing w:before="20" w:after="40"/>
       </w:pPr>
-      <w:r/>
       <w:r>
         <w:rPr>
           <w:b/>
@@ -3796,7 +4337,6 @@
         <w:pStyle w:val="ListBullet"/>
         <w:spacing w:before="20" w:after="40"/>
       </w:pPr>
-      <w:r/>
       <w:r>
         <w:rPr>
           <w:b/>
@@ -3812,7 +4352,6 @@
         <w:pStyle w:val="ListBullet"/>
         <w:spacing w:before="20" w:after="40"/>
       </w:pPr>
-      <w:r/>
       <w:r>
         <w:rPr>
           <w:b/>
@@ -3828,7 +4367,6 @@
         <w:pStyle w:val="ListBullet"/>
         <w:spacing w:before="20" w:after="40"/>
       </w:pPr>
-      <w:r/>
       <w:r>
         <w:rPr>
           <w:rFonts w:ascii="Consolas" w:hAnsi="Consolas"/>
@@ -3846,7 +4384,6 @@
         <w:pStyle w:val="ListBullet"/>
         <w:spacing w:before="20" w:after="40"/>
       </w:pPr>
-      <w:r/>
       <w:r>
         <w:rPr>
           <w:rFonts w:ascii="Consolas" w:hAnsi="Consolas"/>
@@ -3875,7 +4412,6 @@
         <w:pStyle w:val="ListBullet"/>
         <w:spacing w:before="20" w:after="40"/>
       </w:pPr>
-      <w:r/>
       <w:r>
         <w:rPr>
           <w:b/>
@@ -3971,7 +4507,6 @@
         <w:pStyle w:val="ListBullet"/>
         <w:spacing w:before="20" w:after="40"/>
       </w:pPr>
-      <w:r/>
       <w:r>
         <w:rPr>
           <w:b/>
@@ -3989,14 +4524,12 @@
         </w:rPr>
         <w:t>/api/genomics/real-variants</w:t>
       </w:r>
-      <w:r/>
     </w:p>
     <w:p>
       <w:pPr>
         <w:pStyle w:val="ListBullet"/>
         <w:spacing w:before="20" w:after="40"/>
       </w:pPr>
-      <w:r/>
       <w:r>
         <w:rPr>
           <w:b/>
@@ -4014,14 +4547,12 @@
         </w:rPr>
         <w:t>GET</w:t>
       </w:r>
-      <w:r/>
     </w:p>
     <w:p>
       <w:pPr>
         <w:pStyle w:val="ListBullet"/>
         <w:spacing w:before="20" w:after="40"/>
       </w:pPr>
-      <w:r/>
       <w:r>
         <w:rPr>
           <w:b/>
@@ -4037,7 +4568,6 @@
         <w:pStyle w:val="ListBullet"/>
         <w:spacing w:before="20" w:after="40"/>
       </w:pPr>
-      <w:r/>
       <w:r>
         <w:rPr>
           <w:b/>
@@ -4053,7 +4583,6 @@
         <w:pStyle w:val="ListBullet"/>
         <w:spacing w:before="20" w:after="40"/>
       </w:pPr>
-      <w:r/>
       <w:r>
         <w:rPr>
           <w:b/>
@@ -4175,7 +4704,6 @@
         <w:pStyle w:val="ListBullet"/>
         <w:spacing w:before="20" w:after="40"/>
       </w:pPr>
-      <w:r/>
       <w:r>
         <w:rPr>
           <w:b/>
@@ -4193,14 +4721,12 @@
         </w:rPr>
         <w:t>/api/discovery/cohort-count</w:t>
       </w:r>
-      <w:r/>
     </w:p>
     <w:p>
       <w:pPr>
         <w:pStyle w:val="ListBullet"/>
         <w:spacing w:before="20" w:after="40"/>
       </w:pPr>
-      <w:r/>
       <w:r>
         <w:rPr>
           <w:b/>
@@ -4218,14 +4744,12 @@
         </w:rPr>
         <w:t>POST</w:t>
       </w:r>
-      <w:r/>
     </w:p>
     <w:p>
       <w:pPr>
         <w:pStyle w:val="ListBullet"/>
         <w:spacing w:before="20" w:after="40"/>
       </w:pPr>
-      <w:r/>
       <w:r>
         <w:rPr>
           <w:b/>
@@ -4241,7 +4765,6 @@
         <w:pStyle w:val="ListBullet"/>
         <w:spacing w:before="20" w:after="40"/>
       </w:pPr>
-      <w:r/>
       <w:r>
         <w:rPr>
           <w:b/>
@@ -4257,7 +4780,6 @@
         <w:pStyle w:val="ListBullet"/>
         <w:spacing w:before="20" w:after="40"/>
       </w:pPr>
-      <w:r/>
       <w:r>
         <w:rPr>
           <w:b/>
@@ -4313,7 +4835,6 @@
         <w:pStyle w:val="ListBullet"/>
         <w:spacing w:before="20" w:after="40"/>
       </w:pPr>
-      <w:r/>
       <w:r>
         <w:rPr>
           <w:b/>
@@ -4490,7 +5011,13 @@
               <w:rPr>
                 <w:sz w:val="19"/>
               </w:rPr>
-              <w:t>**Membership Inference Attack**</w:t>
+            </w:r>
+            <w:r>
+              <w:rPr>
+                <w:b/>
+                <w:sz w:val="19"/>
+              </w:rPr>
+              <w:t>Membership Inference Attack</w:t>
             </w:r>
           </w:p>
         </w:tc>
@@ -4503,6 +5030,11 @@
             <w:pPr>
               <w:spacing w:before="60" w:after="60"/>
             </w:pPr>
+            <w:r>
+              <w:rPr>
+                <w:sz w:val="19"/>
+              </w:rPr>
+            </w:r>
             <w:r>
               <w:rPr>
                 <w:sz w:val="19"/>
@@ -4524,7 +5056,27 @@
               <w:rPr>
                 <w:sz w:val="19"/>
               </w:rPr>
-              <w:t>Perturbs local weight gradients with Laplace differential privacy ($\Delta_S = 0.2, \epsilon \le 10.0$); tracks privacy loss with RDP moments accountant.</w:t>
+            </w:r>
+            <w:r>
+              <w:rPr>
+                <w:sz w:val="19"/>
+              </w:rPr>
+              <w:t>Perturbs local weight gradients with Laplace differential privacy (</w:t>
+            </w:r>
+            <w:r>
+              <w:rPr>
+                <w:rFonts w:ascii="Cambria Math" w:hAnsi="Cambria Math"/>
+                <w:i/>
+                <w:color w:val="1A365D"/>
+                <w:sz w:val="21"/>
+              </w:rPr>
+              <w:t>‖Δ‖_‖S‖ ‖=‖ ‖0‖.‖2‖,‖ ‖ε‖ ‖ ‖≤‖ ‖ ‖1‖0‖.‖0‖</w:t>
+            </w:r>
+            <w:r>
+              <w:rPr>
+                <w:sz w:val="19"/>
+              </w:rPr>
+              <w:t>); tracks privacy loss with RDP moments accountant.</w:t>
             </w:r>
           </w:p>
         </w:tc>
@@ -4543,7 +5095,13 @@
               <w:rPr>
                 <w:sz w:val="19"/>
               </w:rPr>
-              <w:t>**Small-Cell Linkage Attack**</w:t>
+            </w:r>
+            <w:r>
+              <w:rPr>
+                <w:b/>
+                <w:sz w:val="19"/>
+              </w:rPr>
+              <w:t>Small-Cell Linkage Attack</w:t>
             </w:r>
           </w:p>
         </w:tc>
@@ -4556,6 +5114,11 @@
             <w:pPr>
               <w:spacing w:before="60" w:after="60"/>
             </w:pPr>
+            <w:r>
+              <w:rPr>
+                <w:sz w:val="19"/>
+              </w:rPr>
+            </w:r>
             <w:r>
               <w:rPr>
                 <w:sz w:val="19"/>
@@ -4577,7 +5140,42 @@
               <w:rPr>
                 <w:sz w:val="19"/>
               </w:rPr>
-              <w:t>Enforces $k$-anonymity suppression ($k \ge 5$) on all cohort discovery queries.</w:t>
+            </w:r>
+            <w:r>
+              <w:rPr>
+                <w:sz w:val="19"/>
+              </w:rPr>
+              <w:t xml:space="preserve">Enforces </w:t>
+            </w:r>
+            <w:r>
+              <w:rPr>
+                <w:rFonts w:ascii="Cambria Math" w:hAnsi="Cambria Math"/>
+                <w:i/>
+                <w:color w:val="1A365D"/>
+                <w:sz w:val="21"/>
+              </w:rPr>
+              <w:t>‖k‖</w:t>
+            </w:r>
+            <w:r>
+              <w:rPr>
+                <w:sz w:val="19"/>
+              </w:rPr>
+              <w:t>-anonymity suppression (</w:t>
+            </w:r>
+            <w:r>
+              <w:rPr>
+                <w:rFonts w:ascii="Cambria Math" w:hAnsi="Cambria Math"/>
+                <w:i/>
+                <w:color w:val="1A365D"/>
+                <w:sz w:val="21"/>
+              </w:rPr>
+              <w:t>‖k‖ ‖ ‖≥‖ ‖ ‖5‖</w:t>
+            </w:r>
+            <w:r>
+              <w:rPr>
+                <w:sz w:val="19"/>
+              </w:rPr>
+              <w:t>) on all cohort discovery queries.</w:t>
             </w:r>
           </w:p>
         </w:tc>
@@ -4596,7 +5194,13 @@
               <w:rPr>
                 <w:sz w:val="19"/>
               </w:rPr>
-              <w:t>**Model Inversion Attack**</w:t>
+            </w:r>
+            <w:r>
+              <w:rPr>
+                <w:b/>
+                <w:sz w:val="19"/>
+              </w:rPr>
+              <w:t>Model Inversion Attack</w:t>
             </w:r>
           </w:p>
         </w:tc>
@@ -4609,6 +5213,11 @@
             <w:pPr>
               <w:spacing w:before="60" w:after="60"/>
             </w:pPr>
+            <w:r>
+              <w:rPr>
+                <w:sz w:val="19"/>
+              </w:rPr>
+            </w:r>
             <w:r>
               <w:rPr>
                 <w:sz w:val="19"/>
@@ -4630,7 +5239,40 @@
               <w:rPr>
                 <w:sz w:val="19"/>
               </w:rPr>
-              <w:t>Restricts `/api/fl/model-inspect` to authenticated users with `researcher` role JWTs.</w:t>
+            </w:r>
+            <w:r>
+              <w:rPr>
+                <w:sz w:val="19"/>
+              </w:rPr>
+              <w:t xml:space="preserve">Restricts </w:t>
+            </w:r>
+            <w:r>
+              <w:rPr>
+                <w:rFonts w:ascii="Consolas" w:hAnsi="Consolas"/>
+                <w:color w:val="805AD5"/>
+                <w:sz w:val="19"/>
+              </w:rPr>
+              <w:t>/api/fl/model-inspect</w:t>
+            </w:r>
+            <w:r>
+              <w:rPr>
+                <w:sz w:val="19"/>
+              </w:rPr>
+              <w:t xml:space="preserve"> to authenticated users with </w:t>
+            </w:r>
+            <w:r>
+              <w:rPr>
+                <w:rFonts w:ascii="Consolas" w:hAnsi="Consolas"/>
+                <w:color w:val="805AD5"/>
+                <w:sz w:val="19"/>
+              </w:rPr>
+              <w:t>researcher</w:t>
+            </w:r>
+            <w:r>
+              <w:rPr>
+                <w:sz w:val="19"/>
+              </w:rPr>
+              <w:t xml:space="preserve"> role JWTs.</w:t>
             </w:r>
           </w:p>
         </w:tc>
@@ -4649,7 +5291,13 @@
               <w:rPr>
                 <w:sz w:val="19"/>
               </w:rPr>
-              <w:t>**Brute Force / DoS**</w:t>
+            </w:r>
+            <w:r>
+              <w:rPr>
+                <w:b/>
+                <w:sz w:val="19"/>
+              </w:rPr>
+              <w:t>Brute Force / DoS</w:t>
             </w:r>
           </w:p>
         </w:tc>
@@ -4662,6 +5310,11 @@
             <w:pPr>
               <w:spacing w:before="60" w:after="60"/>
             </w:pPr>
+            <w:r>
+              <w:rPr>
+                <w:sz w:val="19"/>
+              </w:rPr>
+            </w:r>
             <w:r>
               <w:rPr>
                 <w:sz w:val="19"/>
@@ -4679,6 +5332,11 @@
             <w:pPr>
               <w:spacing w:before="60" w:after="60"/>
             </w:pPr>
+            <w:r>
+              <w:rPr>
+                <w:sz w:val="19"/>
+              </w:rPr>
+            </w:r>
             <w:r>
               <w:rPr>
                 <w:sz w:val="19"/>
@@ -4702,7 +5360,13 @@
               <w:rPr>
                 <w:sz w:val="19"/>
               </w:rPr>
-              <w:t>**Credential Compromise**</w:t>
+            </w:r>
+            <w:r>
+              <w:rPr>
+                <w:b/>
+                <w:sz w:val="19"/>
+              </w:rPr>
+              <w:t>Credential Compromise</w:t>
             </w:r>
           </w:p>
         </w:tc>
@@ -4715,6 +5379,11 @@
             <w:pPr>
               <w:spacing w:before="60" w:after="60"/>
             </w:pPr>
+            <w:r>
+              <w:rPr>
+                <w:sz w:val="19"/>
+              </w:rPr>
+            </w:r>
             <w:r>
               <w:rPr>
                 <w:sz w:val="19"/>
@@ -4736,7 +5405,26 @@
               <w:rPr>
                 <w:sz w:val="19"/>
               </w:rPr>
-              <w:t>Passwords salt-hashed with bcrypt; short-lived JWT tokens (60 min expiry); secrets loaded dynamically from environment variables (`MEDLINK_JWT_SECRET`).</w:t>
+            </w:r>
+            <w:r>
+              <w:rPr>
+                <w:sz w:val="19"/>
+              </w:rPr>
+              <w:t>Passwords salt-hashed with bcrypt; short-lived JWT tokens (60 min expiry); secrets loaded dynamically from environment variables (</w:t>
+            </w:r>
+            <w:r>
+              <w:rPr>
+                <w:rFonts w:ascii="Consolas" w:hAnsi="Consolas"/>
+                <w:color w:val="805AD5"/>
+                <w:sz w:val="19"/>
+              </w:rPr>
+              <w:t>MEDLINK_JWT_SECRET</w:t>
+            </w:r>
+            <w:r>
+              <w:rPr>
+                <w:sz w:val="19"/>
+              </w:rPr>
+              <w:t>).</w:t>
             </w:r>
           </w:p>
         </w:tc>

</xml_diff>